<commit_message>
Continuacion de Ejercicios de Numpy y Pandas
</commit_message>
<xml_diff>
--- a/Retroalimentación.docx
+++ b/Retroalimentación.docx
@@ -508,7 +508,7 @@
           <w:szCs w:val="28"/>
         </w:rPr>
         <w:drawing>
-          <wp:anchor distT="0" distB="0" distL="114300" distR="114300" simplePos="0" relativeHeight="251672576" behindDoc="0" locked="0" layoutInCell="1" allowOverlap="1" wp14:anchorId="09624FB7" wp14:editId="0B2698DE">
+          <wp:anchor distT="0" distB="0" distL="114300" distR="114300" simplePos="0" relativeHeight="251672576" behindDoc="0" locked="0" layoutInCell="1" allowOverlap="1" wp14:anchorId="09624FB7" wp14:editId="09EF86E4">
             <wp:simplePos x="0" y="0"/>
             <wp:positionH relativeFrom="column">
               <wp:posOffset>1104595</wp:posOffset>
@@ -609,7 +609,7 @@
           <w:szCs w:val="28"/>
         </w:rPr>
         <w:drawing>
-          <wp:anchor distT="0" distB="0" distL="114300" distR="114300" simplePos="0" relativeHeight="251686912" behindDoc="0" locked="0" layoutInCell="1" allowOverlap="1" wp14:anchorId="42F4EECC" wp14:editId="5D87A442">
+          <wp:anchor distT="0" distB="0" distL="114300" distR="114300" simplePos="0" relativeHeight="251686912" behindDoc="0" locked="0" layoutInCell="1" allowOverlap="1" wp14:anchorId="42F4EECC" wp14:editId="6607C9AC">
             <wp:simplePos x="0" y="0"/>
             <wp:positionH relativeFrom="column">
               <wp:posOffset>1094893</wp:posOffset>
@@ -739,7 +739,7 @@
         </w:rPr>
         <w:lastRenderedPageBreak/>
         <w:drawing>
-          <wp:anchor distT="0" distB="0" distL="114300" distR="114300" simplePos="0" relativeHeight="251673600" behindDoc="0" locked="0" layoutInCell="1" allowOverlap="1" wp14:anchorId="7A5FA093" wp14:editId="20C85D21">
+          <wp:anchor distT="0" distB="0" distL="114300" distR="114300" simplePos="0" relativeHeight="251673600" behindDoc="0" locked="0" layoutInCell="1" allowOverlap="1" wp14:anchorId="7A5FA093" wp14:editId="35792E2B">
             <wp:simplePos x="0" y="0"/>
             <wp:positionH relativeFrom="column">
               <wp:posOffset>1172337</wp:posOffset>
@@ -829,7 +829,7 @@
           <w:szCs w:val="28"/>
         </w:rPr>
         <w:drawing>
-          <wp:anchor distT="0" distB="0" distL="114300" distR="114300" simplePos="0" relativeHeight="251687936" behindDoc="0" locked="0" layoutInCell="1" allowOverlap="1" wp14:anchorId="07AB8912" wp14:editId="64120674">
+          <wp:anchor distT="0" distB="0" distL="114300" distR="114300" simplePos="0" relativeHeight="251687936" behindDoc="0" locked="0" layoutInCell="1" allowOverlap="1" wp14:anchorId="07AB8912" wp14:editId="60DE4BC0">
             <wp:simplePos x="0" y="0"/>
             <wp:positionH relativeFrom="column">
               <wp:posOffset>1067181</wp:posOffset>
@@ -4751,7 +4751,7 @@
         <w:rFonts w:hint="default"/>
       </w:rPr>
     </w:lvl>
-    <w:lvl w:ilvl="1" w:tplc="280A0019" w:tentative="1">
+    <w:lvl w:ilvl="1" w:tplc="280A0019">
       <w:start w:val="1"/>
       <w:numFmt w:val="lowerLetter"/>
       <w:lvlText w:val="%2."/>

</xml_diff>